<commit_message>
Add EST 320 office hours, update NYU MA details, refresh CV
Co-Authored-By: Claude Opus 5 (1M context) <noreply@anthropic.com>
</commit_message>
<xml_diff>
--- a/PSdocuments/WangXi_CV_July_13_2026.docx
+++ b/PSdocuments/WangXi_CV_July_13_2026.docx
@@ -133,67 +133,7 @@
           <w:sz w:val="22"/>
           <w:szCs w:val="22"/>
         </w:rPr>
-        <w:t>Ph</w:t>
-      </w:r>
-      <w:r>
-        <w:rPr>
-          <w:rFonts w:ascii="Times New Roman" w:hAnsi="Times New Roman" w:cs="Times New Roman"/>
-          <w:i/>
-          <w:iCs/>
-          <w:sz w:val="22"/>
-          <w:szCs w:val="22"/>
-        </w:rPr>
-        <w:t>.</w:t>
-      </w:r>
-      <w:r>
-        <w:rPr>
-          <w:rFonts w:ascii="Times New Roman" w:hAnsi="Times New Roman" w:cs="Times New Roman"/>
-          <w:i/>
-          <w:iCs/>
-          <w:sz w:val="22"/>
-          <w:szCs w:val="22"/>
-        </w:rPr>
-        <w:t>D</w:t>
-      </w:r>
-      <w:r>
-        <w:rPr>
-          <w:rFonts w:ascii="Times New Roman" w:hAnsi="Times New Roman" w:cs="Times New Roman"/>
-          <w:i/>
-          <w:iCs/>
-          <w:sz w:val="22"/>
-          <w:szCs w:val="22"/>
-        </w:rPr>
-        <w:t xml:space="preserve">. in </w:t>
-      </w:r>
-      <w:r>
-        <w:rPr>
-          <w:rFonts w:ascii="Times New Roman" w:hAnsi="Times New Roman" w:cs="Times New Roman"/>
-          <w:i/>
-          <w:iCs/>
-          <w:sz w:val="22"/>
-          <w:szCs w:val="22"/>
-        </w:rPr>
-        <w:t xml:space="preserve">Engineering </w:t>
-      </w:r>
-      <w:r>
-        <w:rPr>
-          <w:rFonts w:ascii="Times New Roman" w:hAnsi="Times New Roman" w:cs="Times New Roman"/>
-          <w:i/>
-          <w:iCs/>
-          <w:sz w:val="22"/>
-          <w:szCs w:val="22"/>
-        </w:rPr>
-        <w:t>and</w:t>
-      </w:r>
-      <w:r>
-        <w:rPr>
-          <w:rFonts w:ascii="Times New Roman" w:hAnsi="Times New Roman" w:cs="Times New Roman"/>
-          <w:i/>
-          <w:iCs/>
-          <w:sz w:val="22"/>
-          <w:szCs w:val="22"/>
-        </w:rPr>
-        <w:t xml:space="preserve"> Applied Science</w:t>
+        <w:t>Ph.D. Student, Department of Engineering and Applied Science</w:t>
       </w:r>
       <w:r>
         <w:rPr>
@@ -1068,7 +1008,15 @@
           <w:sz w:val="22"/>
           <w:szCs w:val="22"/>
         </w:rPr>
-        <w:t>., Li, X., Wu, G., Castelo Quispe, S., &amp; Silva, C. (2025</w:t>
+        <w:t>., Li, X., Wu, G., Castelo Quispe, S., &amp; Silva, C. (202</w:t>
+      </w:r>
+      <w:r>
+        <w:rPr>
+          <w:rFonts w:ascii="Times New Roman" w:hAnsi="Times New Roman" w:cs="Times New Roman" w:hint="eastAsia"/>
+          <w:sz w:val="22"/>
+          <w:szCs w:val="22"/>
+        </w:rPr>
+        <w:t>6</w:t>
       </w:r>
       <w:r>
         <w:rPr>
@@ -1182,8 +1130,6 @@
       <w:r>
         <w:rPr>
           <w:rFonts w:ascii="Times New Roman" w:hAnsi="Times New Roman" w:cs="Times New Roman"/>
-          <w:b/>
-          <w:bCs/>
           <w:color w:val="000000" w:themeColor="text1"/>
           <w:sz w:val="22"/>
           <w:szCs w:val="22"/>
@@ -1294,98 +1240,82 @@
         <w:ind w:firstLineChars="0"/>
         <w:rPr>
           <w:rFonts w:ascii="Times New Roman" w:hAnsi="Times New Roman" w:cs="Times New Roman"/>
-          <w:sz w:val="22"/>
-          <w:szCs w:val="22"/>
-        </w:rPr>
-      </w:pPr>
-      <w:r>
-        <w:rPr>
-          <w:rFonts w:ascii="Times New Roman" w:hAnsi="Times New Roman" w:cs="Times New Roman"/>
-          <w:b/>
-          <w:bCs/>
-          <w:color w:val="2E74B5" w:themeColor="accent5" w:themeShade="BF"/>
-          <w:sz w:val="22"/>
-          <w:szCs w:val="22"/>
-        </w:rPr>
-        <w:t xml:space="preserve">Wang, </w:t>
-      </w:r>
-      <w:r>
-        <w:rPr>
-          <w:rFonts w:ascii="Times New Roman" w:hAnsi="Times New Roman" w:cs="Times New Roman"/>
-          <w:b/>
-          <w:bCs/>
-          <w:color w:val="2E74B5" w:themeColor="accent5" w:themeShade="BF"/>
-          <w:sz w:val="22"/>
-          <w:szCs w:val="22"/>
-        </w:rPr>
-        <w:t>G</w:t>
-      </w:r>
-      <w:r>
-        <w:rPr>
-          <w:rFonts w:ascii="Times New Roman" w:hAnsi="Times New Roman" w:cs="Times New Roman"/>
-          <w:b/>
-          <w:bCs/>
-          <w:color w:val="2E74B5" w:themeColor="accent5" w:themeShade="BF"/>
-          <w:sz w:val="22"/>
-          <w:szCs w:val="22"/>
-        </w:rPr>
-        <w:t>.</w:t>
-      </w:r>
-      <w:r>
-        <w:rPr>
-          <w:rFonts w:ascii="Times New Roman" w:hAnsi="Times New Roman" w:cs="Times New Roman"/>
-          <w:b/>
-          <w:bCs/>
-          <w:sz w:val="22"/>
-          <w:szCs w:val="22"/>
-        </w:rPr>
-        <w:t xml:space="preserve">, </w:t>
-      </w:r>
-      <w:r>
-        <w:rPr>
-          <w:rFonts w:ascii="Times New Roman" w:hAnsi="Times New Roman" w:cs="Times New Roman"/>
-          <w:sz w:val="22"/>
-          <w:szCs w:val="22"/>
-        </w:rPr>
-        <w:t>&amp; Shen, Y. (2025). </w:t>
-      </w:r>
-      <w:r>
-        <w:rPr>
-          <w:rFonts w:ascii="Times New Roman" w:hAnsi="Times New Roman" w:cs="Times New Roman"/>
           <w:i/>
           <w:iCs/>
           <w:sz w:val="22"/>
           <w:szCs w:val="22"/>
         </w:rPr>
-        <w:t>Home environment and students’ creative thinking: An educational data science analysis of PISA 2022.</w:t>
-      </w:r>
-      <w:r>
-        <w:rPr>
-          <w:rFonts w:ascii="Times New Roman" w:hAnsi="Times New Roman" w:cs="Times New Roman"/>
-          <w:b/>
-          <w:bCs/>
-          <w:sz w:val="22"/>
-          <w:szCs w:val="22"/>
-        </w:rPr>
-        <w:t> AERA 202</w:t>
-      </w:r>
-      <w:r>
-        <w:rPr>
-          <w:rFonts w:ascii="Times New Roman" w:hAnsi="Times New Roman" w:cs="Times New Roman"/>
-          <w:b/>
-          <w:bCs/>
-          <w:sz w:val="22"/>
-          <w:szCs w:val="22"/>
-        </w:rPr>
-        <w:t>6</w:t>
-      </w:r>
-      <w:r>
-        <w:rPr>
-          <w:rFonts w:ascii="Times New Roman" w:hAnsi="Times New Roman" w:cs="Times New Roman"/>
-          <w:sz w:val="22"/>
-          <w:szCs w:val="22"/>
-        </w:rPr>
-        <w:t>.</w:t>
+      </w:pPr>
+      <w:r>
+        <w:rPr>
+          <w:rFonts w:ascii="Times New Roman" w:hAnsi="Times New Roman" w:cs="Times New Roman"/>
+          <w:b/>
+          <w:bCs/>
+          <w:color w:val="2E74B5" w:themeColor="accent5" w:themeShade="BF"/>
+          <w:sz w:val="22"/>
+          <w:szCs w:val="22"/>
+        </w:rPr>
+        <w:t>Wang, G.</w:t>
+      </w:r>
+      <w:r>
+        <w:rPr>
+          <w:rFonts w:ascii="Times New Roman" w:hAnsi="Times New Roman" w:cs="Times New Roman"/>
+          <w:sz w:val="22"/>
+          <w:szCs w:val="22"/>
+        </w:rPr>
+        <w:t>, Li, H., Lin, S., Wen, Y., Hu, J., &amp; Jin, Y. (2026).</w:t>
+      </w:r>
+      <w:r>
+        <w:rPr>
+          <w:rFonts w:ascii="Times New Roman" w:hAnsi="Times New Roman" w:cs="Times New Roman"/>
+          <w:i/>
+          <w:iCs/>
+          <w:sz w:val="22"/>
+          <w:szCs w:val="22"/>
+        </w:rPr>
+        <w:t xml:space="preserve"> </w:t>
+      </w:r>
+      <w:proofErr w:type="spellStart"/>
+      <w:r>
+        <w:rPr>
+          <w:rFonts w:ascii="Times New Roman" w:hAnsi="Times New Roman" w:cs="Times New Roman"/>
+          <w:i/>
+          <w:iCs/>
+          <w:sz w:val="22"/>
+          <w:szCs w:val="22"/>
+        </w:rPr>
+        <w:t>Feelium</w:t>
+      </w:r>
+      <w:proofErr w:type="spellEnd"/>
+      <w:r>
+        <w:rPr>
+          <w:rFonts w:ascii="Times New Roman" w:hAnsi="Times New Roman" w:cs="Times New Roman"/>
+          <w:i/>
+          <w:iCs/>
+          <w:sz w:val="22"/>
+          <w:szCs w:val="22"/>
+        </w:rPr>
+        <w:t xml:space="preserve">: A Touchable Blimp Body for Aerial Telepresence. </w:t>
+      </w:r>
+      <w:r>
+        <w:rPr>
+          <w:rFonts w:ascii="Times New Roman" w:hAnsi="Times New Roman" w:cs="Times New Roman"/>
+          <w:b/>
+          <w:bCs/>
+          <w:sz w:val="22"/>
+          <w:szCs w:val="22"/>
+        </w:rPr>
+        <w:t xml:space="preserve">ACM UIST </w:t>
+      </w:r>
+      <w:r>
+        <w:rPr>
+          <w:rFonts w:ascii="Times New Roman" w:hAnsi="Times New Roman" w:cs="Times New Roman"/>
+          <w:b/>
+          <w:bCs/>
+          <w:sz w:val="22"/>
+          <w:szCs w:val="22"/>
+        </w:rPr>
+        <w:t>EA</w:t>
       </w:r>
     </w:p>
     <w:p>
@@ -1399,8 +1329,6 @@
         <w:ind w:firstLineChars="0"/>
         <w:rPr>
           <w:rFonts w:ascii="Times New Roman" w:hAnsi="Times New Roman" w:cs="Times New Roman"/>
-          <w:b/>
-          <w:bCs/>
           <w:sz w:val="22"/>
           <w:szCs w:val="22"/>
         </w:rPr>
@@ -1444,7 +1372,25 @@
           <w:sz w:val="22"/>
           <w:szCs w:val="22"/>
         </w:rPr>
-        <w:t xml:space="preserve">, Zhang, S. Y., Meng, F., &amp; Li, L. (2025). </w:t>
+        <w:t>,</w:t>
+      </w:r>
+      <w:r>
+        <w:rPr>
+          <w:rFonts w:ascii="Times New Roman" w:hAnsi="Times New Roman" w:cs="Times New Roman"/>
+          <w:b/>
+          <w:bCs/>
+          <w:sz w:val="22"/>
+          <w:szCs w:val="22"/>
+        </w:rPr>
+        <w:t xml:space="preserve"> </w:t>
+      </w:r>
+      <w:r>
+        <w:rPr>
+          <w:rFonts w:ascii="Times New Roman" w:hAnsi="Times New Roman" w:cs="Times New Roman"/>
+          <w:sz w:val="22"/>
+          <w:szCs w:val="22"/>
+        </w:rPr>
+        <w:t>&amp; Shen, Y. (2025). </w:t>
       </w:r>
       <w:r>
         <w:rPr>
@@ -1454,35 +1400,35 @@
           <w:sz w:val="22"/>
           <w:szCs w:val="22"/>
         </w:rPr>
-        <w:t>The hidden pitfalls of e-dictionaries: How inaccuracies affect Chinese language users</w:t>
-      </w:r>
-      <w:r>
-        <w:rPr>
-          <w:rFonts w:ascii="Times New Roman" w:hAnsi="Times New Roman" w:cs="Times New Roman"/>
-          <w:sz w:val="22"/>
-          <w:szCs w:val="22"/>
-        </w:rPr>
-        <w:t xml:space="preserve">. </w:t>
-      </w:r>
-      <w:r>
-        <w:rPr>
-          <w:rFonts w:ascii="Times New Roman" w:hAnsi="Times New Roman" w:cs="Times New Roman"/>
-          <w:i/>
-          <w:iCs/>
-          <w:sz w:val="22"/>
-          <w:szCs w:val="22"/>
-        </w:rPr>
-        <w:t xml:space="preserve">Lexicography: </w:t>
-      </w:r>
-      <w:r>
-        <w:rPr>
-          <w:rFonts w:ascii="Times New Roman" w:hAnsi="Times New Roman" w:cs="Times New Roman"/>
-          <w:b/>
-          <w:bCs/>
-          <w:sz w:val="22"/>
-          <w:szCs w:val="22"/>
-        </w:rPr>
-        <w:t xml:space="preserve">Journal of ASIALEX. </w:t>
+        <w:t>Home environment and students’ creative thinking: An educational data science analysis of PISA 2022.</w:t>
+      </w:r>
+      <w:r>
+        <w:rPr>
+          <w:rFonts w:ascii="Times New Roman" w:hAnsi="Times New Roman" w:cs="Times New Roman"/>
+          <w:b/>
+          <w:bCs/>
+          <w:sz w:val="22"/>
+          <w:szCs w:val="22"/>
+        </w:rPr>
+        <w:t> AERA 202</w:t>
+      </w:r>
+      <w:r>
+        <w:rPr>
+          <w:rFonts w:ascii="Times New Roman" w:hAnsi="Times New Roman" w:cs="Times New Roman"/>
+          <w:b/>
+          <w:bCs/>
+          <w:sz w:val="22"/>
+          <w:szCs w:val="22"/>
+        </w:rPr>
+        <w:t>6</w:t>
+      </w:r>
+      <w:r>
+        <w:rPr>
+          <w:rFonts w:ascii="Times New Roman" w:hAnsi="Times New Roman" w:cs="Times New Roman"/>
+          <w:sz w:val="22"/>
+          <w:szCs w:val="22"/>
+        </w:rPr>
+        <w:t>.</w:t>
       </w:r>
     </w:p>
     <w:p>
@@ -1504,14 +1450,14 @@
       </w:pPr>
       <w:r>
         <w:rPr>
-          <w:rFonts w:ascii="Times New Roman" w:hAnsi="Times New Roman" w:cs="Times New Roman" w:hint="eastAsia"/>
+          <w:rFonts w:ascii="Times New Roman" w:hAnsi="Times New Roman" w:cs="Times New Roman"/>
           <w:b/>
           <w:bCs/>
           <w:color w:val="2E74B5" w:themeColor="accent5" w:themeShade="BF"/>
           <w:sz w:val="22"/>
           <w:szCs w:val="22"/>
         </w:rPr>
-        <w:t>Wang</w:t>
+        <w:t xml:space="preserve">Wang, </w:t>
       </w:r>
       <w:r>
         <w:rPr>
@@ -1522,7 +1468,7 @@
           <w:sz w:val="22"/>
           <w:szCs w:val="22"/>
         </w:rPr>
-        <w:t xml:space="preserve">, </w:t>
+        <w:t>G</w:t>
       </w:r>
       <w:r>
         <w:rPr>
@@ -1533,17 +1479,6 @@
           <w:sz w:val="22"/>
           <w:szCs w:val="22"/>
         </w:rPr>
-        <w:t>G</w:t>
-      </w:r>
-      <w:r>
-        <w:rPr>
-          <w:rFonts w:ascii="Times New Roman" w:hAnsi="Times New Roman" w:cs="Times New Roman"/>
-          <w:b/>
-          <w:bCs/>
-          <w:color w:val="2E74B5" w:themeColor="accent5" w:themeShade="BF"/>
-          <w:sz w:val="22"/>
-          <w:szCs w:val="22"/>
-        </w:rPr>
         <w:t>.</w:t>
       </w:r>
       <w:r>
@@ -1552,103 +1487,7 @@
           <w:sz w:val="22"/>
           <w:szCs w:val="22"/>
         </w:rPr>
-        <w:t xml:space="preserve">, </w:t>
-      </w:r>
-      <w:r>
-        <w:rPr>
-          <w:rFonts w:ascii="Times New Roman" w:hAnsi="Times New Roman" w:cs="Times New Roman" w:hint="eastAsia"/>
-          <w:sz w:val="22"/>
-          <w:szCs w:val="22"/>
-        </w:rPr>
-        <w:t>Meng</w:t>
-      </w:r>
-      <w:r>
-        <w:rPr>
-          <w:rFonts w:ascii="Times New Roman" w:hAnsi="Times New Roman" w:cs="Times New Roman"/>
-          <w:sz w:val="22"/>
-          <w:szCs w:val="22"/>
-        </w:rPr>
-        <w:t>, F.F.,</w:t>
-      </w:r>
-      <w:r>
-        <w:rPr>
-          <w:rFonts w:ascii="Times New Roman" w:hAnsi="Times New Roman" w:cs="Times New Roman" w:hint="eastAsia"/>
-          <w:sz w:val="22"/>
-          <w:szCs w:val="22"/>
-        </w:rPr>
-        <w:t xml:space="preserve"> </w:t>
-      </w:r>
-      <w:r>
-        <w:rPr>
-          <w:rFonts w:ascii="Times New Roman" w:hAnsi="Times New Roman" w:cs="Times New Roman"/>
-          <w:sz w:val="22"/>
-          <w:szCs w:val="22"/>
-        </w:rPr>
-        <w:t>&amp; Zhang, S.Y.</w:t>
-      </w:r>
-      <w:r>
-        <w:rPr>
-          <w:rFonts w:ascii="Times New Roman" w:hAnsi="Times New Roman" w:cs="Times New Roman"/>
-          <w:sz w:val="22"/>
-          <w:szCs w:val="22"/>
-        </w:rPr>
-        <w:t>,</w:t>
-      </w:r>
-      <w:r>
-        <w:rPr>
-          <w:rFonts w:ascii="Times New Roman" w:hAnsi="Times New Roman" w:cs="Times New Roman"/>
-          <w:sz w:val="22"/>
-          <w:szCs w:val="22"/>
-        </w:rPr>
-        <w:t xml:space="preserve"> Li, L.</w:t>
-      </w:r>
-      <w:r>
-        <w:rPr>
-          <w:rFonts w:ascii="Times New Roman" w:hAnsi="Times New Roman" w:cs="Times New Roman"/>
-          <w:sz w:val="22"/>
-          <w:szCs w:val="22"/>
-        </w:rPr>
-        <w:t xml:space="preserve"> </w:t>
-      </w:r>
-      <w:r>
-        <w:rPr>
-          <w:rFonts w:ascii="Times New Roman" w:hAnsi="Times New Roman" w:cs="Times New Roman"/>
-          <w:sz w:val="22"/>
-          <w:szCs w:val="22"/>
-        </w:rPr>
-        <w:t xml:space="preserve">(2023). </w:t>
-      </w:r>
-      <w:r>
-        <w:rPr>
-          <w:rFonts w:ascii="Times New Roman" w:hAnsi="Times New Roman" w:cs="Times New Roman" w:hint="eastAsia"/>
-          <w:sz w:val="22"/>
-          <w:szCs w:val="22"/>
-        </w:rPr>
-        <w:t>I</w:t>
-      </w:r>
-      <w:r>
-        <w:rPr>
-          <w:rFonts w:ascii="Times New Roman" w:hAnsi="Times New Roman" w:cs="Times New Roman"/>
-          <w:sz w:val="22"/>
-          <w:szCs w:val="22"/>
-        </w:rPr>
-        <w:t xml:space="preserve">naccuracy of an E-Dictionary and </w:t>
-      </w:r>
-      <w:r>
-        <w:rPr>
-          <w:rFonts w:ascii="Times New Roman" w:hAnsi="Times New Roman" w:cs="Times New Roman" w:hint="eastAsia"/>
-          <w:sz w:val="22"/>
-          <w:szCs w:val="22"/>
-        </w:rPr>
-        <w:t>i</w:t>
-      </w:r>
-      <w:r>
-        <w:rPr>
-          <w:rFonts w:ascii="Times New Roman" w:hAnsi="Times New Roman" w:cs="Times New Roman"/>
-          <w:sz w:val="22"/>
-          <w:szCs w:val="22"/>
-        </w:rPr>
-        <w:t xml:space="preserve">ts influence on Chinese language users. </w:t>
+        <w:t xml:space="preserve">, Zhang, S. Y., Meng, F., &amp; Li, L. (2025). </w:t>
       </w:r>
       <w:r>
         <w:rPr>
@@ -1658,41 +1497,35 @@
           <w:sz w:val="22"/>
           <w:szCs w:val="22"/>
         </w:rPr>
-        <w:t>Proceedings of the 16th International Conference of the Asian Association for Lexicography</w:t>
-      </w:r>
-      <w:r>
-        <w:rPr>
-          <w:rFonts w:ascii="Times New Roman" w:hAnsi="Times New Roman" w:cs="Times New Roman"/>
-          <w:sz w:val="22"/>
-          <w:szCs w:val="22"/>
-        </w:rPr>
-        <w:t xml:space="preserve"> (pp.113-125). </w:t>
-      </w:r>
-      <w:r>
-        <w:rPr>
-          <w:rFonts w:ascii="Times New Roman" w:hAnsi="Times New Roman" w:cs="Times New Roman" w:hint="eastAsia"/>
-          <w:sz w:val="22"/>
-          <w:szCs w:val="22"/>
-        </w:rPr>
-        <w:t>Seoul</w:t>
-      </w:r>
-      <w:r>
-        <w:rPr>
-          <w:rFonts w:ascii="Times New Roman" w:hAnsi="Times New Roman" w:cs="Times New Roman"/>
-          <w:sz w:val="22"/>
-          <w:szCs w:val="22"/>
-        </w:rPr>
-        <w:t xml:space="preserve">: Yonsei University. </w:t>
-      </w:r>
-      <w:r>
-        <w:rPr>
-          <w:rFonts w:ascii="Times New Roman" w:hAnsi="Times New Roman" w:cs="Times New Roman"/>
-          <w:b/>
-          <w:bCs/>
-          <w:sz w:val="22"/>
-          <w:szCs w:val="22"/>
-        </w:rPr>
-        <w:t>ASIALEX 2023</w:t>
+        <w:t>The hidden pitfalls of e-dictionaries: How inaccuracies affect Chinese language users</w:t>
+      </w:r>
+      <w:r>
+        <w:rPr>
+          <w:rFonts w:ascii="Times New Roman" w:hAnsi="Times New Roman" w:cs="Times New Roman"/>
+          <w:sz w:val="22"/>
+          <w:szCs w:val="22"/>
+        </w:rPr>
+        <w:t xml:space="preserve">. </w:t>
+      </w:r>
+      <w:r>
+        <w:rPr>
+          <w:rFonts w:ascii="Times New Roman" w:hAnsi="Times New Roman" w:cs="Times New Roman"/>
+          <w:i/>
+          <w:iCs/>
+          <w:sz w:val="22"/>
+          <w:szCs w:val="22"/>
+        </w:rPr>
+        <w:t xml:space="preserve">Lexicography: </w:t>
+      </w:r>
+      <w:r>
+        <w:rPr>
+          <w:rFonts w:ascii="Times New Roman" w:hAnsi="Times New Roman" w:cs="Times New Roman"/>
+          <w:b/>
+          <w:bCs/>
+          <w:sz w:val="22"/>
+          <w:szCs w:val="22"/>
+        </w:rPr>
+        <w:t xml:space="preserve">Journal of ASIALEX. </w:t>
       </w:r>
     </w:p>
     <w:p>
@@ -1714,14 +1547,14 @@
       </w:pPr>
       <w:r>
         <w:rPr>
-          <w:rFonts w:ascii="Times New Roman" w:hAnsi="Times New Roman" w:cs="Times New Roman"/>
+          <w:rFonts w:ascii="Times New Roman" w:hAnsi="Times New Roman" w:cs="Times New Roman" w:hint="eastAsia"/>
           <w:b/>
           <w:bCs/>
           <w:color w:val="2E74B5" w:themeColor="accent5" w:themeShade="BF"/>
           <w:sz w:val="22"/>
           <w:szCs w:val="22"/>
         </w:rPr>
-        <w:t xml:space="preserve">Wang, </w:t>
+        <w:t>Wang</w:t>
       </w:r>
       <w:r>
         <w:rPr>
@@ -1732,6 +1565,17 @@
           <w:sz w:val="22"/>
           <w:szCs w:val="22"/>
         </w:rPr>
+        <w:t xml:space="preserve">, </w:t>
+      </w:r>
+      <w:r>
+        <w:rPr>
+          <w:rFonts w:ascii="Times New Roman" w:hAnsi="Times New Roman" w:cs="Times New Roman"/>
+          <w:b/>
+          <w:bCs/>
+          <w:color w:val="2E74B5" w:themeColor="accent5" w:themeShade="BF"/>
+          <w:sz w:val="22"/>
+          <w:szCs w:val="22"/>
+        </w:rPr>
         <w:t>G</w:t>
       </w:r>
       <w:r>
@@ -1748,8 +1592,6 @@
       <w:r>
         <w:rPr>
           <w:rFonts w:ascii="Times New Roman" w:hAnsi="Times New Roman" w:cs="Times New Roman"/>
-          <w:b/>
-          <w:bCs/>
           <w:sz w:val="22"/>
           <w:szCs w:val="22"/>
         </w:rPr>
@@ -1757,11 +1599,99 @@
       </w:r>
       <w:r>
         <w:rPr>
-          <w:rFonts w:ascii="Times New Roman" w:hAnsi="Times New Roman" w:cs="Times New Roman"/>
-          <w:sz w:val="22"/>
-          <w:szCs w:val="22"/>
-        </w:rPr>
-        <w:t>Hu, J., &amp; Ali, S. (2025). </w:t>
+          <w:rFonts w:ascii="Times New Roman" w:hAnsi="Times New Roman" w:cs="Times New Roman" w:hint="eastAsia"/>
+          <w:sz w:val="22"/>
+          <w:szCs w:val="22"/>
+        </w:rPr>
+        <w:t>Meng</w:t>
+      </w:r>
+      <w:r>
+        <w:rPr>
+          <w:rFonts w:ascii="Times New Roman" w:hAnsi="Times New Roman" w:cs="Times New Roman"/>
+          <w:sz w:val="22"/>
+          <w:szCs w:val="22"/>
+        </w:rPr>
+        <w:t>, F.F.,</w:t>
+      </w:r>
+      <w:r>
+        <w:rPr>
+          <w:rFonts w:ascii="Times New Roman" w:hAnsi="Times New Roman" w:cs="Times New Roman" w:hint="eastAsia"/>
+          <w:sz w:val="22"/>
+          <w:szCs w:val="22"/>
+        </w:rPr>
+        <w:t xml:space="preserve"> </w:t>
+      </w:r>
+      <w:r>
+        <w:rPr>
+          <w:rFonts w:ascii="Times New Roman" w:hAnsi="Times New Roman" w:cs="Times New Roman"/>
+          <w:sz w:val="22"/>
+          <w:szCs w:val="22"/>
+        </w:rPr>
+        <w:t>&amp; Zhang, S.Y.</w:t>
+      </w:r>
+      <w:r>
+        <w:rPr>
+          <w:rFonts w:ascii="Times New Roman" w:hAnsi="Times New Roman" w:cs="Times New Roman"/>
+          <w:sz w:val="22"/>
+          <w:szCs w:val="22"/>
+        </w:rPr>
+        <w:t>,</w:t>
+      </w:r>
+      <w:r>
+        <w:rPr>
+          <w:rFonts w:ascii="Times New Roman" w:hAnsi="Times New Roman" w:cs="Times New Roman"/>
+          <w:sz w:val="22"/>
+          <w:szCs w:val="22"/>
+        </w:rPr>
+        <w:t xml:space="preserve"> Li, L.</w:t>
+      </w:r>
+      <w:r>
+        <w:rPr>
+          <w:rFonts w:ascii="Times New Roman" w:hAnsi="Times New Roman" w:cs="Times New Roman"/>
+          <w:sz w:val="22"/>
+          <w:szCs w:val="22"/>
+        </w:rPr>
+        <w:t xml:space="preserve"> </w:t>
+      </w:r>
+      <w:r>
+        <w:rPr>
+          <w:rFonts w:ascii="Times New Roman" w:hAnsi="Times New Roman" w:cs="Times New Roman"/>
+          <w:sz w:val="22"/>
+          <w:szCs w:val="22"/>
+        </w:rPr>
+        <w:t xml:space="preserve">(2023). </w:t>
+      </w:r>
+      <w:r>
+        <w:rPr>
+          <w:rFonts w:ascii="Times New Roman" w:hAnsi="Times New Roman" w:cs="Times New Roman" w:hint="eastAsia"/>
+          <w:sz w:val="22"/>
+          <w:szCs w:val="22"/>
+        </w:rPr>
+        <w:t>I</w:t>
+      </w:r>
+      <w:r>
+        <w:rPr>
+          <w:rFonts w:ascii="Times New Roman" w:hAnsi="Times New Roman" w:cs="Times New Roman"/>
+          <w:sz w:val="22"/>
+          <w:szCs w:val="22"/>
+        </w:rPr>
+        <w:t xml:space="preserve">naccuracy of an E-Dictionary and </w:t>
+      </w:r>
+      <w:r>
+        <w:rPr>
+          <w:rFonts w:ascii="Times New Roman" w:hAnsi="Times New Roman" w:cs="Times New Roman" w:hint="eastAsia"/>
+          <w:sz w:val="22"/>
+          <w:szCs w:val="22"/>
+        </w:rPr>
+        <w:t>i</w:t>
+      </w:r>
+      <w:r>
+        <w:rPr>
+          <w:rFonts w:ascii="Times New Roman" w:hAnsi="Times New Roman" w:cs="Times New Roman"/>
+          <w:sz w:val="22"/>
+          <w:szCs w:val="22"/>
+        </w:rPr>
+        <w:t xml:space="preserve">ts influence on Chinese language users. </w:t>
       </w:r>
       <w:r>
         <w:rPr>
@@ -1771,15 +1701,41 @@
           <w:sz w:val="22"/>
           <w:szCs w:val="22"/>
         </w:rPr>
-        <w:t>MAATS: A Multi Agent Automated Translation System Based on MQM Evaluation</w:t>
-      </w:r>
-      <w:r>
-        <w:rPr>
-          <w:rFonts w:ascii="Times New Roman" w:hAnsi="Times New Roman" w:cs="Times New Roman"/>
-          <w:sz w:val="22"/>
-          <w:szCs w:val="22"/>
-        </w:rPr>
-        <w:t xml:space="preserve">. </w:t>
+        <w:t>Proceedings of the 16th International Conference of the Asian Association for Lexicography</w:t>
+      </w:r>
+      <w:r>
+        <w:rPr>
+          <w:rFonts w:ascii="Times New Roman" w:hAnsi="Times New Roman" w:cs="Times New Roman"/>
+          <w:sz w:val="22"/>
+          <w:szCs w:val="22"/>
+        </w:rPr>
+        <w:t xml:space="preserve"> (pp.113-125). </w:t>
+      </w:r>
+      <w:r>
+        <w:rPr>
+          <w:rFonts w:ascii="Times New Roman" w:hAnsi="Times New Roman" w:cs="Times New Roman" w:hint="eastAsia"/>
+          <w:sz w:val="22"/>
+          <w:szCs w:val="22"/>
+        </w:rPr>
+        <w:t>Seoul</w:t>
+      </w:r>
+      <w:r>
+        <w:rPr>
+          <w:rFonts w:ascii="Times New Roman" w:hAnsi="Times New Roman" w:cs="Times New Roman"/>
+          <w:sz w:val="22"/>
+          <w:szCs w:val="22"/>
+        </w:rPr>
+        <w:t xml:space="preserve">: Yonsei University. </w:t>
+      </w:r>
+      <w:r>
+        <w:rPr>
+          <w:rFonts w:ascii="Times New Roman" w:hAnsi="Times New Roman" w:cs="Times New Roman"/>
+          <w:b/>
+          <w:bCs/>
+          <w:sz w:val="22"/>
+          <w:szCs w:val="22"/>
+        </w:rPr>
+        <w:t>ASIALEX 2023</w:t>
       </w:r>
     </w:p>
     <w:bookmarkEnd w:id="0"/>
@@ -7298,6 +7254,7 @@
   <w:style w:type="character" w:default="1" w:styleId="DefaultParagraphFont">
     <w:name w:val="Default Paragraph Font"/>
     <w:uiPriority w:val="1"/>
+    <w:semiHidden/>
     <w:unhideWhenUsed/>
   </w:style>
   <w:style w:type="table" w:default="1" w:styleId="TableNormal">

</xml_diff>